<commit_message>
Updated README and the Lesson Plan doc to point to this repo since we can only submit that file.
</commit_message>
<xml_diff>
--- a/Funding_Futures_Lesson_Plan.docx
+++ b/Funding_Futures_Lesson_Plan.docx
@@ -39,32 +39,105 @@
       <w:pPr>
         <w:spacing w:after="300"/>
         <w:jc w:val="center"/>
-      </w:pPr>
-      <w:r>
         <w:rPr>
           <w:i/>
           <w:iCs/>
           <w:color w:val="555555"/>
         </w:rPr>
-        <w:t xml:space="preserve">Using the </w:t>
-      </w:r>
-      <w:proofErr w:type="spellStart"/>
+      </w:pPr>
       <w:r>
         <w:rPr>
           <w:i/>
           <w:iCs/>
           <w:color w:val="555555"/>
         </w:rPr>
-        <w:t>edfinr</w:t>
-      </w:r>
-      <w:proofErr w:type="spellEnd"/>
+        <w:t xml:space="preserve">Using the </w:t>
+      </w:r>
+      <w:proofErr w:type="spellStart"/>
       <w:r>
         <w:rPr>
           <w:i/>
           <w:iCs/>
           <w:color w:val="555555"/>
         </w:rPr>
+        <w:t>edfinr</w:t>
+      </w:r>
+      <w:proofErr w:type="spellEnd"/>
+      <w:r>
+        <w:rPr>
+          <w:i/>
+          <w:iCs/>
+          <w:color w:val="555555"/>
+        </w:rPr>
         <w:t xml:space="preserve"> Package and the California Cradle-to-Career Student Pathways Dashboard</w:t>
+      </w:r>
+    </w:p>
+    <w:p>
+      <w:pPr>
+        <w:spacing w:after="300"/>
+        <w:jc w:val="center"/>
+      </w:pPr>
+      <w:r>
+        <w:rPr>
+          <w:b/>
+          <w:bCs/>
+          <w:i/>
+          <w:iCs/>
+          <w:color w:val="555555"/>
+          <w:u w:val="single"/>
+        </w:rPr>
+        <w:t>NOTE</w:t>
+      </w:r>
+      <w:r>
+        <w:rPr>
+          <w:i/>
+          <w:iCs/>
+          <w:color w:val="555555"/>
+        </w:rPr>
+        <w:t>: A full repo with all files needed for this lesson</w:t>
+      </w:r>
+      <w:r>
+        <w:rPr>
+          <w:i/>
+          <w:iCs/>
+          <w:color w:val="555555"/>
+        </w:rPr>
+        <w:t xml:space="preserve"> – including slides and the R Markdown Lab Notebook - </w:t>
+      </w:r>
+      <w:r>
+        <w:rPr>
+          <w:i/>
+          <w:iCs/>
+          <w:color w:val="555555"/>
+        </w:rPr>
+        <w:t xml:space="preserve"> is available at:</w:t>
+      </w:r>
+      <w:r>
+        <w:rPr>
+          <w:i/>
+          <w:iCs/>
+          <w:color w:val="555555"/>
+        </w:rPr>
+        <w:br/>
+        <w:t xml:space="preserve"> </w:t>
+      </w:r>
+      <w:hyperlink r:id="rId5" w:history="1">
+        <w:r>
+          <w:rPr>
+            <w:rStyle w:val="Hyperlink"/>
+            <w:i/>
+            <w:iCs/>
+          </w:rPr>
+          <w:t>https://github.com/mlchrzan/Funding-Futures</w:t>
+        </w:r>
+      </w:hyperlink>
+      <w:r>
+        <w:rPr>
+          <w:i/>
+          <w:iCs/>
+          <w:color w:val="555555"/>
+        </w:rPr>
+        <w:t xml:space="preserve"> </w:t>
       </w:r>
     </w:p>
     <w:tbl>
@@ -917,6 +990,7 @@
           <w:sz w:val="32"/>
           <w:szCs w:val="32"/>
         </w:rPr>
+        <w:lastRenderedPageBreak/>
         <w:t>Overview of Lesson Plan</w:t>
       </w:r>
     </w:p>
@@ -973,7 +1047,6 @@
                 <w:sz w:val="20"/>
                 <w:szCs w:val="20"/>
               </w:rPr>
-              <w:lastRenderedPageBreak/>
               <w:t>Time</w:t>
             </w:r>
           </w:p>
@@ -1802,6 +1875,7 @@
         <w:rPr>
           <w:color w:val="1A1A2E"/>
         </w:rPr>
+        <w:lastRenderedPageBreak/>
         <w:t xml:space="preserve">Introduction to </w:t>
       </w:r>
       <w:proofErr w:type="spellStart"/>
@@ -1832,7 +1906,6 @@
         <w:rPr>
           <w:color w:val="1A1A2E"/>
         </w:rPr>
-        <w:lastRenderedPageBreak/>
         <w:t>The C2C Student Pathways Dashboard: how it connects funding context to student outcomes across the K-12-to-career continuum.</w:t>
       </w:r>
     </w:p>
@@ -2489,6 +2562,7 @@
         <w:rPr>
           <w:color w:val="1A1A2E"/>
         </w:rPr>
+        <w:lastRenderedPageBreak/>
         <w:t>Looking at both your R visualization and the C2C dashboard, where do you see the funding patterns showing up in student outcomes?</w:t>
       </w:r>
     </w:p>
@@ -2505,7 +2579,6 @@
         <w:rPr>
           <w:color w:val="1A1A2E"/>
         </w:rPr>
-        <w:lastRenderedPageBreak/>
         <w:t>Some student groups in the C2C dashboard are suppressed. Based on what you know about data suppression, which communities are most affected by this? What are the implications for advocacy and policy?</w:t>
       </w:r>
     </w:p>
@@ -2928,6 +3001,7 @@
         <w:rPr>
           <w:color w:val="1A1A2E"/>
         </w:rPr>
+        <w:lastRenderedPageBreak/>
         <w:t xml:space="preserve">Undergraduate students, especially first-generation college students and community college transfers, often attended K-12 schools that appear in the lower-funding bands of the </w:t>
       </w:r>
       <w:proofErr w:type="spellStart"/>
@@ -2954,14 +3028,7 @@
         <w:rPr>
           <w:color w:val="1A1A2E"/>
         </w:rPr>
-        <w:t xml:space="preserve"> The lesson </w:t>
-      </w:r>
-      <w:r>
-        <w:rPr>
-          <w:color w:val="1A1A2E"/>
-        </w:rPr>
-        <w:lastRenderedPageBreak/>
-        <w:t>creates a direct line between national finance data and the students' own lived experience. The discussion prompts explicitly ask: 'If you attended a school with low per-pupil spending, how might that have shaped your pathway to college?'</w:t>
+        <w:t xml:space="preserve"> The lesson creates a direct line between national finance data and the students' own lived experience. The discussion prompts explicitly ask: 'If you attended a school with low per-pupil spending, how might that have shaped your pathway to college?'</w:t>
       </w:r>
       <w:r>
         <w:rPr>
@@ -2973,7 +3040,13 @@
         <w:rPr>
           <w:color w:val="1A1A2E"/>
         </w:rPr>
-        <w:t xml:space="preserve"> The C2C student story blog </w:t>
+        <w:t xml:space="preserve"> The</w:t>
+      </w:r>
+      <w:r>
+        <w:rPr>
+          <w:color w:val="1A1A2E"/>
+        </w:rPr>
+        <w:t xml:space="preserve"> C2C student story blog </w:t>
       </w:r>
       <w:r>
         <w:rPr>
@@ -3055,7 +3128,13 @@
         <w:rPr>
           <w:color w:val="1A1A2E"/>
         </w:rPr>
-        <w:t xml:space="preserve"> equity-focused data work simultaneously, setting the tone for a course built around data literacy as a tool for social change. It could also be taught in Week 8–10 after students have R basics, allowing them to work more independently on the notebook. For courses in education policy, it pairs well with readings on the history of school finance litigation (e.g., Serrano v. Priest, Rodriguez v. San Antonio). For data science courses, it provides meaningful real-world dataset</w:t>
+        <w:t xml:space="preserve"> equity-focused data work simultaneously, setting the tone for a course built around data literacy as a tool for social change. It could also be taught in Week 8–10 after students have R basics, allowing them to work more independently on the notebook. For courses in education policy, it pairs well with readings on the history of school finance litigation (e.g., Serrano v. Priest, Rodriguez v. San Antonio). For data science courses, it provides </w:t>
+      </w:r>
+      <w:r>
+        <w:rPr>
+          <w:color w:val="1A1A2E"/>
+        </w:rPr>
+        <w:t>meaningful real-world dataset</w:t>
       </w:r>
       <w:r>
         <w:rPr>
@@ -4032,6 +4111,18 @@
       <w:szCs w:val="20"/>
     </w:rPr>
   </w:style>
+  <w:style w:type="character" w:styleId="UnresolvedMention">
+    <w:name w:val="Unresolved Mention"/>
+    <w:basedOn w:val="DefaultParagraphFont"/>
+    <w:uiPriority w:val="99"/>
+    <w:semiHidden/>
+    <w:unhideWhenUsed/>
+    <w:rsid w:val="00675F84"/>
+    <w:rPr>
+      <w:color w:val="605E5C"/>
+      <w:shd w:val="clear" w:color="auto" w:fill="E1DFDD"/>
+    </w:rPr>
+  </w:style>
 </w:styles>
 </file>
 

</xml_diff>